<commit_message>
A Private Spy: indent the 'Today, when we read of undercover policemen' passage
Co-Authored-By: Claude Sonnet 5.5 <noreply@anthropic.com>
</commit_message>
<xml_diff>
--- a/content-src/docx/R TLS 2022 10 14 le Carre letters.docx
+++ b/content-src/docx/R TLS 2022 10 14 le Carre letters.docx
@@ -1298,13 +1298,16 @@
         </w:rPr>
       </w:pPr>
       <w:r>
+        <w:t xml:space="preserve">&lt;quote&gt;</w:t>
+      </w:r>
+      <w:r>
         <w:rPr>
           <w:rFonts w:ascii="Times New Roman" w:eastAsia="Times New Roman" w:hAnsi="Times New Roman" w:cs="Times New Roman"/>
           <w:color w:val="757575"/>
           <w:sz w:val="27"/>
           <w:szCs w:val="27"/>
         </w:rPr>
-        <w:t>“Today, when we read of undercover policemen worming their way into peace and animal-rights organizations, taking lovers and fathering children under false identities, we are repelled because we know at once that the targets never justified the deception or the human cost. Harry, thank God, did not operate that way, and he believed absolutely that his work was morally justified. He saw international communism as his country’s enemy, and its British manifestation as the enemy inside the home camp. No British</w:t>
+        <w:t xml:space="preserve">Today, when we read of undercover policemen worming their way into peace and animal-rights organizations, taking lovers and fathering children under false identities, we are repelled because we know at once that the targets never justified the deception or the human cost. Harry, thank God, did not operate that way, and he believed absolutely that his work was morally justified. He saw international communism as his country’s enemy, and its British manifestation as the enemy inside the home camp. No British</w:t>
       </w:r>
       <w:r>
         <w:rPr>
@@ -1313,7 +1316,10 @@
           <w:sz w:val="27"/>
           <w:szCs w:val="27"/>
         </w:rPr>
-        <w:t xml:space="preserve"> communist I ever met would have subscribed to that view. The British establishment emphatically did, and that was good enough for Harry.”</w:t>
+        <w:t xml:space="preserve"> communist I ever met would have subscribed to that view. The British establishment emphatically did, and that was good enough for Harry.</w:t>
+      </w:r>
+      <w:r>
+        <w:t xml:space="preserve">&lt;/quote&gt;</w:t>
       </w:r>
     </w:p>
     <w:p>

</xml_diff>